<commit_message>
feat: mejoras en pliego_licitacion, proyectos, servicios y ubi_web
Ajustes de flujo y plantillas en los cuatro módulos de negocio (pasos del
pliego, gestión de imágenes, exportación a Word, catálogo de servicios,
ubicaciones), y limpieza de plantillas legacy (login propio reemplazado
por allauth, logo antiguo).

Co-Authored-By: Claude Opus 5 <noreply@anthropic.com>
</commit_message>
<xml_diff>
--- a/proyectos/templates/word_templates/template_especificaciones.docx
+++ b/proyectos/templates/word_templates/template_especificaciones.docx
@@ -64,7 +64,7 @@
   <w:tbl>
     <w:tblPr>
       <w:tblStyle w:val="TableGrid"/>
-      <w:tblW w:w="9776" w:type="dxa"/>
+      <w:tblW w:w="8784" w:type="dxa"/>
       <w:jc w:val="center"/>
       <w:tblCellMar>
         <w:left w:w="70" w:type="dxa"/>
@@ -73,9 +73,10 @@
       <w:tblLook w:val="04A0" w:firstRow="1" w:lastRow="0" w:firstColumn="1" w:lastColumn="0" w:noHBand="0" w:noVBand="1"/>
     </w:tblPr>
     <w:tblGrid>
-      <w:gridCol w:w="1696"/>
-      <w:gridCol w:w="5812"/>
-      <w:gridCol w:w="2268"/>
+      <w:gridCol w:w="1261"/>
+      <w:gridCol w:w="2847"/>
+      <w:gridCol w:w="2866"/>
+      <w:gridCol w:w="1810"/>
     </w:tblGrid>
     <w:tr>
       <w:trPr>
@@ -84,16 +85,14 @@
       </w:trPr>
       <w:tc>
         <w:tcPr>
-          <w:tcW w:w="1696" w:type="dxa"/>
+          <w:tcW w:w="1261" w:type="dxa"/>
           <w:vMerge w:val="restart"/>
           <w:tcBorders>
             <w:top w:val="single" w:sz="4" w:space="0" w:color="auto"/>
             <w:left w:val="single" w:sz="4" w:space="0" w:color="auto"/>
-            <w:bottom w:val="nil"/>
             <w:right w:val="single" w:sz="4" w:space="0" w:color="auto"/>
           </w:tcBorders>
           <w:vAlign w:val="center"/>
-          <w:hideMark/>
         </w:tcPr>
         <w:p>
           <w:pPr>
@@ -111,71 +110,14 @@
               <w:sz w:val="24"/>
               <w14:ligatures w14:val="standardContextual"/>
             </w:rPr>
-            <w:drawing>
-              <wp:anchor distT="0" distB="0" distL="114300" distR="114300" simplePos="0" relativeHeight="251659264" behindDoc="0" locked="0" layoutInCell="1" allowOverlap="1" wp14:anchorId="227EC393" wp14:editId="2100D0A9">
-                <wp:simplePos x="0" y="0"/>
-                <wp:positionH relativeFrom="column">
-                  <wp:posOffset>38735</wp:posOffset>
-                </wp:positionH>
-                <wp:positionV relativeFrom="paragraph">
-                  <wp:posOffset>60325</wp:posOffset>
-                </wp:positionV>
-                <wp:extent cx="923925" cy="1209675"/>
-                <wp:effectExtent l="0" t="0" r="9525" b="9525"/>
-                <wp:wrapNone/>
-                <wp:docPr id="564223649" name="Picture 1"/>
-                <wp:cNvGraphicFramePr>
-                  <a:graphicFrameLocks xmlns:a="http://schemas.openxmlformats.org/drawingml/2006/main" noChangeAspect="1"/>
-                </wp:cNvGraphicFramePr>
-                <a:graphic xmlns:a="http://schemas.openxmlformats.org/drawingml/2006/main">
-                  <a:graphicData uri="http://schemas.openxmlformats.org/drawingml/2006/picture">
-                    <pic:pic xmlns:pic="http://schemas.openxmlformats.org/drawingml/2006/picture">
-                      <pic:nvPicPr>
-                        <pic:cNvPr id="0" name="Imagen 6"/>
-                        <pic:cNvPicPr>
-                          <a:picLocks noChangeAspect="1" noChangeArrowheads="1"/>
-                        </pic:cNvPicPr>
-                      </pic:nvPicPr>
-                      <pic:blipFill>
-                        <a:blip r:embed="rId1">
-                          <a:extLst>
-                            <a:ext uri="{28A0092B-C50C-407E-A947-70E740481C1C}">
-                              <a14:useLocalDpi xmlns:a14="http://schemas.microsoft.com/office/drawing/2010/main" val="0"/>
-                            </a:ext>
-                          </a:extLst>
-                        </a:blip>
-                        <a:srcRect/>
-                        <a:stretch>
-                          <a:fillRect/>
-                        </a:stretch>
-                      </pic:blipFill>
-                      <pic:spPr bwMode="auto">
-                        <a:xfrm>
-                          <a:off x="0" y="0"/>
-                          <a:ext cx="923925" cy="1209675"/>
-                        </a:xfrm>
-                        <a:prstGeom prst="rect">
-                          <a:avLst/>
-                        </a:prstGeom>
-                        <a:noFill/>
-                      </pic:spPr>
-                    </pic:pic>
-                  </a:graphicData>
-                </a:graphic>
-                <wp14:sizeRelH relativeFrom="margin">
-                  <wp14:pctWidth>0</wp14:pctWidth>
-                </wp14:sizeRelH>
-                <wp14:sizeRelV relativeFrom="margin">
-                  <wp14:pctHeight>0</wp14:pctHeight>
-                </wp14:sizeRelV>
-              </wp:anchor>
-            </w:drawing>
+            <w:t>&lt;&lt;LOGO&gt;&gt;</w:t>
           </w:r>
         </w:p>
       </w:tc>
       <w:tc>
         <w:tcPr>
-          <w:tcW w:w="5812" w:type="dxa"/>
+          <w:tcW w:w="5713" w:type="dxa"/>
+          <w:gridSpan w:val="2"/>
           <w:tcBorders>
             <w:top w:val="single" w:sz="4" w:space="0" w:color="auto"/>
             <w:left w:val="single" w:sz="4" w:space="0" w:color="auto"/>
@@ -206,40 +148,10 @@
             <w:t>PLIEGO DE ESPECIFICACIONES</w:t>
           </w:r>
         </w:p>
-        <w:p>
-          <w:pPr>
-            <w:pStyle w:val="Header"/>
-            <w:jc w:val="center"/>
-            <w:rPr>
-              <w:rFonts w:ascii="Calibri Light" w:hAnsi="Calibri Light" w:cs="Calibri Light"/>
-              <w:b/>
-              <w:bCs/>
-              <w:sz w:val="20"/>
-            </w:rPr>
-          </w:pPr>
-          <w:r>
-            <w:rPr>
-              <w:rFonts w:ascii="Calibri Light" w:hAnsi="Calibri Light" w:cs="Calibri Light"/>
-              <w:b/>
-              <w:bCs/>
-              <w:sz w:val="20"/>
-            </w:rPr>
-            <w:t xml:space="preserve">NRO. PR: </w:t>
-          </w:r>
-          <w:r>
-            <w:rPr>
-              <w:rFonts w:ascii="Calibri Light" w:hAnsi="Calibri Light" w:cs="Calibri Light"/>
-              <w:b/>
-              <w:bCs/>
-              <w:sz w:val="20"/>
-            </w:rPr>
-            <w:t>&lt;&lt;NRO_PLIEGO&gt;&gt;</w:t>
-          </w:r>
-        </w:p>
       </w:tc>
       <w:tc>
         <w:tcPr>
-          <w:tcW w:w="2268" w:type="dxa"/>
+          <w:tcW w:w="1810" w:type="dxa"/>
           <w:tcBorders>
             <w:top w:val="single" w:sz="4" w:space="0" w:color="auto"/>
             <w:left w:val="single" w:sz="4" w:space="0" w:color="auto"/>
@@ -297,16 +209,13 @@
       </w:trPr>
       <w:tc>
         <w:tcPr>
-          <w:tcW w:w="0" w:type="auto"/>
+          <w:tcW w:w="1261" w:type="dxa"/>
           <w:vMerge/>
           <w:tcBorders>
-            <w:top w:val="single" w:sz="4" w:space="0" w:color="auto"/>
             <w:left w:val="single" w:sz="4" w:space="0" w:color="auto"/>
-            <w:bottom w:val="nil"/>
             <w:right w:val="single" w:sz="4" w:space="0" w:color="auto"/>
           </w:tcBorders>
           <w:vAlign w:val="center"/>
-          <w:hideMark/>
         </w:tcPr>
         <w:p>
           <w:pPr>
@@ -321,7 +230,8 @@
       </w:tc>
       <w:tc>
         <w:tcPr>
-          <w:tcW w:w="5812" w:type="dxa"/>
+          <w:tcW w:w="5713" w:type="dxa"/>
+          <w:gridSpan w:val="2"/>
           <w:tcBorders>
             <w:top w:val="single" w:sz="4" w:space="0" w:color="auto"/>
             <w:left w:val="single" w:sz="4" w:space="0" w:color="auto"/>
@@ -376,7 +286,7 @@
       </w:tc>
       <w:tc>
         <w:tcPr>
-          <w:tcW w:w="2268" w:type="dxa"/>
+          <w:tcW w:w="1810" w:type="dxa"/>
           <w:tcBorders>
             <w:top w:val="single" w:sz="4" w:space="0" w:color="auto"/>
             <w:left w:val="single" w:sz="4" w:space="0" w:color="auto"/>
@@ -401,380 +311,7 @@
               <w:bCs/>
               <w:sz w:val="20"/>
             </w:rPr>
-            <w:t>CENTRO (OPERACIÓN):</w:t>
-          </w:r>
-        </w:p>
-        <w:p>
-          <w:pPr>
-            <w:pStyle w:val="Header"/>
-            <w:jc w:val="center"/>
-            <w:rPr>
-              <w:rFonts w:ascii="Calibri Light" w:hAnsi="Calibri Light" w:cs="Calibri Light"/>
-              <w:b/>
-              <w:bCs/>
-              <w:sz w:val="20"/>
-            </w:rPr>
-          </w:pPr>
-          <w:r>
-            <w:rPr>
-              <w:rFonts w:ascii="Calibri Light" w:hAnsi="Calibri Light" w:cs="Calibri Light"/>
-              <w:i/>
-              <w:iCs/>
-              <w:sz w:val="20"/>
-            </w:rPr>
-            <w:t>&lt;&lt;</w:t>
-          </w:r>
-          <w:r>
-            <w:rPr>
-              <w:rFonts w:ascii="Calibri Light" w:hAnsi="Calibri Light" w:cs="Calibri Light"/>
-              <w:i/>
-              <w:iCs/>
-              <w:sz w:val="20"/>
-            </w:rPr>
-            <w:t>OPERACI</w:t>
-          </w:r>
-          <w:r>
-            <w:rPr>
-              <w:rFonts w:ascii="Calibri Light" w:hAnsi="Calibri Light" w:cs="Calibri Light"/>
-              <w:i/>
-              <w:iCs/>
-              <w:sz w:val="20"/>
-            </w:rPr>
-            <w:t>O</w:t>
-          </w:r>
-          <w:r>
-            <w:rPr>
-              <w:rFonts w:ascii="Calibri Light" w:hAnsi="Calibri Light" w:cs="Calibri Light"/>
-              <w:i/>
-              <w:iCs/>
-              <w:sz w:val="20"/>
-            </w:rPr>
-            <w:t>N</w:t>
-          </w:r>
-          <w:r>
-            <w:rPr>
-              <w:rFonts w:ascii="Calibri Light" w:hAnsi="Calibri Light" w:cs="Calibri Light"/>
-              <w:i/>
-              <w:iCs/>
-              <w:sz w:val="20"/>
-            </w:rPr>
-            <w:t>&gt;&gt;</w:t>
-          </w:r>
-        </w:p>
-      </w:tc>
-    </w:tr>
-    <w:tr>
-      <w:trPr>
-        <w:trHeight w:val="680"/>
-        <w:jc w:val="center"/>
-      </w:trPr>
-      <w:tc>
-        <w:tcPr>
-          <w:tcW w:w="1696" w:type="dxa"/>
-          <w:tcBorders>
-            <w:top w:val="nil"/>
-            <w:left w:val="single" w:sz="4" w:space="0" w:color="auto"/>
-            <w:bottom w:val="single" w:sz="4" w:space="0" w:color="auto"/>
-            <w:right w:val="single" w:sz="4" w:space="0" w:color="auto"/>
-          </w:tcBorders>
-          <w:vAlign w:val="center"/>
-        </w:tcPr>
-        <w:p>
-          <w:pPr>
-            <w:pStyle w:val="Header"/>
-            <w:rPr>
-              <w:rFonts w:ascii="Calibri Light" w:hAnsi="Calibri Light" w:cs="Calibri Light"/>
-              <w:noProof/>
-              <w:sz w:val="20"/>
-            </w:rPr>
-          </w:pPr>
-        </w:p>
-      </w:tc>
-      <w:tc>
-        <w:tcPr>
-          <w:tcW w:w="5812" w:type="dxa"/>
-          <w:vMerge w:val="restart"/>
-          <w:tcBorders>
-            <w:top w:val="single" w:sz="4" w:space="0" w:color="auto"/>
-            <w:left w:val="single" w:sz="4" w:space="0" w:color="auto"/>
-            <w:bottom w:val="single" w:sz="4" w:space="0" w:color="auto"/>
-            <w:right w:val="single" w:sz="4" w:space="0" w:color="auto"/>
-          </w:tcBorders>
-          <w:vAlign w:val="center"/>
-          <w:hideMark/>
-        </w:tcPr>
-        <w:p>
-          <w:pPr>
-            <w:pStyle w:val="Header"/>
-            <w:spacing w:line="276" w:lineRule="auto"/>
-            <w:jc w:val="center"/>
-            <w:rPr>
-              <w:rFonts w:ascii="Calibri Light" w:hAnsi="Calibri Light" w:cs="Calibri Light"/>
-              <w:b/>
-              <w:bCs/>
-              <w:sz w:val="20"/>
-            </w:rPr>
-          </w:pPr>
-          <w:r>
-            <w:rPr>
-              <w:rFonts w:ascii="Calibri Light" w:hAnsi="Calibri Light" w:cs="Calibri Light"/>
-              <w:b/>
-              <w:bCs/>
-              <w:sz w:val="20"/>
-            </w:rPr>
-            <w:t>TIPO DE SERVICIO</w:t>
-          </w:r>
-        </w:p>
-        <w:tbl>
-          <w:tblPr>
-            <w:tblStyle w:val="TableGrid"/>
-            <w:tblW w:w="0" w:type="auto"/>
-            <w:jc w:val="center"/>
-            <w:tblLook w:val="04A0" w:firstRow="1" w:lastRow="0" w:firstColumn="1" w:lastColumn="0" w:noHBand="0" w:noVBand="1"/>
-          </w:tblPr>
-          <w:tblGrid>
-            <w:gridCol w:w="1696"/>
-            <w:gridCol w:w="1843"/>
-            <w:gridCol w:w="1918"/>
-          </w:tblGrid>
-          <w:tr>
-            <w:trPr>
-              <w:trHeight w:val="563"/>
-              <w:jc w:val="center"/>
-            </w:trPr>
-            <w:tc>
-              <w:tcPr>
-                <w:tcW w:w="1696" w:type="dxa"/>
-                <w:tcBorders>
-                  <w:top w:val="single" w:sz="4" w:space="0" w:color="auto"/>
-                  <w:left w:val="single" w:sz="4" w:space="0" w:color="auto"/>
-                  <w:bottom w:val="single" w:sz="4" w:space="0" w:color="auto"/>
-                  <w:right w:val="single" w:sz="4" w:space="0" w:color="auto"/>
-                </w:tcBorders>
-                <w:hideMark/>
-              </w:tcPr>
-              <w:p>
-                <w:pPr>
-                  <w:pStyle w:val="Header"/>
-                  <w:jc w:val="center"/>
-                  <w:rPr>
-                    <w:rFonts w:ascii="Calibri Light" w:hAnsi="Calibri Light" w:cs="Calibri Light"/>
-                    <w:sz w:val="20"/>
-                  </w:rPr>
-                </w:pPr>
-                <w:r>
-                  <w:rPr>
-                    <w:rFonts w:ascii="Calibri Light" w:hAnsi="Calibri Light" w:cs="Calibri Light"/>
-                    <w:sz w:val="20"/>
-                  </w:rPr>
-                  <w:t>SPOT</w:t>
-                </w:r>
-              </w:p>
-              <w:p>
-                <w:pPr>
-                  <w:pStyle w:val="Header"/>
-                  <w:jc w:val="center"/>
-                  <w:rPr>
-                    <w:rFonts w:ascii="Calibri Light" w:hAnsi="Calibri Light" w:cs="Calibri Light"/>
-                    <w:sz w:val="20"/>
-                  </w:rPr>
-                </w:pPr>
-              </w:p>
-              <w:p>
-                <w:pPr>
-                  <w:pStyle w:val="Header"/>
-                  <w:jc w:val="center"/>
-                  <w:rPr>
-                    <w:rFonts w:ascii="Calibri Light" w:hAnsi="Calibri Light" w:cs="Calibri Light"/>
-                    <w:sz w:val="20"/>
-                  </w:rPr>
-                </w:pPr>
-                <w:r>
-                  <w:rPr>
-                    <w:rFonts w:ascii="Calibri Light" w:hAnsi="Calibri Light" w:cs="Calibri Light"/>
-                    <w:noProof/>
-                    <w:sz w:val="20"/>
-                  </w:rPr>
-                  <w:t>&lt;&lt;</w:t>
-                </w:r>
-                <w:r>
-                  <w:rPr>
-                    <w:rFonts w:ascii="Calibri Light" w:hAnsi="Calibri Light" w:cs="Calibri Light"/>
-                    <w:noProof/>
-                    <w:sz w:val="20"/>
-                  </w:rPr>
-                  <w:t>CHK</w:t>
-                </w:r>
-                <w:r>
-                  <w:rPr>
-                    <w:rFonts w:ascii="Calibri Light" w:hAnsi="Calibri Light" w:cs="Calibri Light"/>
-                    <w:noProof/>
-                    <w:sz w:val="20"/>
-                  </w:rPr>
-                  <w:t>_SPOT&gt;&gt;</w:t>
-                </w:r>
-              </w:p>
-            </w:tc>
-            <w:tc>
-              <w:tcPr>
-                <w:tcW w:w="1843" w:type="dxa"/>
-                <w:tcBorders>
-                  <w:top w:val="single" w:sz="4" w:space="0" w:color="auto"/>
-                  <w:left w:val="single" w:sz="4" w:space="0" w:color="auto"/>
-                  <w:bottom w:val="single" w:sz="4" w:space="0" w:color="auto"/>
-                  <w:right w:val="single" w:sz="4" w:space="0" w:color="auto"/>
-                </w:tcBorders>
-                <w:hideMark/>
-              </w:tcPr>
-              <w:p>
-                <w:pPr>
-                  <w:pStyle w:val="Header"/>
-                  <w:jc w:val="center"/>
-                  <w:rPr>
-                    <w:rFonts w:ascii="Calibri Light" w:hAnsi="Calibri Light" w:cs="Calibri Light"/>
-                    <w:sz w:val="20"/>
-                  </w:rPr>
-                </w:pPr>
-                <w:r>
-                  <w:rPr>
-                    <w:rFonts w:ascii="Calibri Light" w:hAnsi="Calibri Light" w:cs="Calibri Light"/>
-                    <w:sz w:val="20"/>
-                  </w:rPr>
-                  <w:t>NUEVOS CONTRATO MARCO</w:t>
-                </w:r>
-              </w:p>
-              <w:p>
-                <w:pPr>
-                  <w:pStyle w:val="Header"/>
-                  <w:jc w:val="center"/>
-                  <w:rPr>
-                    <w:rFonts w:ascii="Calibri Light" w:hAnsi="Calibri Light" w:cs="Calibri Light"/>
-                    <w:sz w:val="20"/>
-                  </w:rPr>
-                </w:pPr>
-                <w:r>
-                  <w:rPr>
-                    <w:rFonts w:ascii="Calibri Light" w:hAnsi="Calibri Light" w:cs="Calibri Light"/>
-                    <w:noProof/>
-                    <w:sz w:val="20"/>
-                  </w:rPr>
-                  <w:t>&lt;&lt;CHK_</w:t>
-                </w:r>
-                <w:r>
-                  <w:rPr>
-                    <w:rFonts w:ascii="Calibri Light" w:hAnsi="Calibri Light" w:cs="Calibri Light"/>
-                    <w:noProof/>
-                    <w:sz w:val="20"/>
-                  </w:rPr>
-                  <w:t>NCM</w:t>
-                </w:r>
-                <w:r>
-                  <w:rPr>
-                    <w:rFonts w:ascii="Calibri Light" w:hAnsi="Calibri Light" w:cs="Calibri Light"/>
-                    <w:noProof/>
-                    <w:sz w:val="20"/>
-                  </w:rPr>
-                  <w:t>&gt;&gt;</w:t>
-                </w:r>
-              </w:p>
-            </w:tc>
-            <w:tc>
-              <w:tcPr>
-                <w:tcW w:w="1918" w:type="dxa"/>
-                <w:tcBorders>
-                  <w:top w:val="single" w:sz="4" w:space="0" w:color="auto"/>
-                  <w:left w:val="single" w:sz="4" w:space="0" w:color="auto"/>
-                  <w:bottom w:val="single" w:sz="4" w:space="0" w:color="auto"/>
-                  <w:right w:val="single" w:sz="4" w:space="0" w:color="auto"/>
-                </w:tcBorders>
-                <w:hideMark/>
-              </w:tcPr>
-              <w:p>
-                <w:pPr>
-                  <w:pStyle w:val="Header"/>
-                  <w:jc w:val="center"/>
-                  <w:rPr>
-                    <w:rFonts w:ascii="Calibri Light" w:hAnsi="Calibri Light" w:cs="Calibri Light"/>
-                    <w:sz w:val="20"/>
-                  </w:rPr>
-                </w:pPr>
-                <w:r>
-                  <w:rPr>
-                    <w:rFonts w:ascii="Calibri Light" w:hAnsi="Calibri Light" w:cs="Calibri Light"/>
-                    <w:sz w:val="20"/>
-                  </w:rPr>
-                  <w:t>CONTRATO DE OBRA</w:t>
-                </w:r>
-              </w:p>
-              <w:p>
-                <w:pPr>
-                  <w:pStyle w:val="Header"/>
-                  <w:jc w:val="center"/>
-                  <w:rPr>
-                    <w:rFonts w:ascii="Calibri Light" w:hAnsi="Calibri Light" w:cs="Calibri Light"/>
-                    <w:sz w:val="20"/>
-                  </w:rPr>
-                </w:pPr>
-              </w:p>
-              <w:p>
-                <w:pPr>
-                  <w:pStyle w:val="Header"/>
-                  <w:jc w:val="center"/>
-                  <w:rPr>
-                    <w:rFonts w:ascii="Calibri Light" w:hAnsi="Calibri Light" w:cs="Calibri Light"/>
-                    <w:sz w:val="20"/>
-                  </w:rPr>
-                </w:pPr>
-                <w:r>
-                  <w:rPr>
-                    <w:rFonts w:ascii="Calibri Light" w:hAnsi="Calibri Light" w:cs="Calibri Light"/>
-                    <w:sz w:val="20"/>
-                  </w:rPr>
-                  <w:t>&lt;&lt;CHK_CO&gt;&gt;</w:t>
-                </w:r>
-              </w:p>
-            </w:tc>
-          </w:tr>
-        </w:tbl>
-        <w:p>
-          <w:pPr>
-            <w:pStyle w:val="Header"/>
-            <w:jc w:val="center"/>
-            <w:rPr>
-              <w:rFonts w:ascii="Calibri Light" w:hAnsi="Calibri Light" w:cs="Calibri Light"/>
-              <w:sz w:val="20"/>
-            </w:rPr>
-          </w:pPr>
-        </w:p>
-      </w:tc>
-      <w:tc>
-        <w:tcPr>
-          <w:tcW w:w="2268" w:type="dxa"/>
-          <w:tcBorders>
-            <w:top w:val="single" w:sz="4" w:space="0" w:color="auto"/>
-            <w:left w:val="single" w:sz="4" w:space="0" w:color="auto"/>
-            <w:bottom w:val="single" w:sz="4" w:space="0" w:color="auto"/>
-            <w:right w:val="single" w:sz="4" w:space="0" w:color="auto"/>
-          </w:tcBorders>
-        </w:tcPr>
-        <w:p>
-          <w:pPr>
-            <w:pStyle w:val="Header"/>
-            <w:rPr>
-              <w:rFonts w:ascii="Calibri Light" w:hAnsi="Calibri Light" w:cs="Calibri Light"/>
-              <w:b/>
-              <w:bCs/>
-              <w:sz w:val="20"/>
-            </w:rPr>
-          </w:pPr>
-          <w:r>
-            <w:rPr>
-              <w:rFonts w:ascii="Calibri Light" w:hAnsi="Calibri Light" w:cs="Calibri Light"/>
-              <w:b/>
-              <w:bCs/>
-              <w:sz w:val="20"/>
-            </w:rPr>
-            <w:t>USUARIO/CONTACTO:</w:t>
+            <w:t>USUARIO:</w:t>
           </w:r>
         </w:p>
         <w:p>
@@ -802,12 +339,210 @@
     </w:tr>
     <w:tr>
       <w:trPr>
-        <w:trHeight w:val="680"/>
+        <w:trHeight w:val="244"/>
         <w:jc w:val="center"/>
       </w:trPr>
       <w:tc>
         <w:tcPr>
-          <w:tcW w:w="1696" w:type="dxa"/>
+          <w:tcW w:w="1261" w:type="dxa"/>
+          <w:vMerge/>
+          <w:tcBorders>
+            <w:left w:val="single" w:sz="4" w:space="0" w:color="auto"/>
+            <w:bottom w:val="single" w:sz="4" w:space="0" w:color="auto"/>
+            <w:right w:val="single" w:sz="4" w:space="0" w:color="auto"/>
+          </w:tcBorders>
+          <w:vAlign w:val="center"/>
+        </w:tcPr>
+        <w:p>
+          <w:pPr>
+            <w:pStyle w:val="Header"/>
+            <w:rPr>
+              <w:rFonts w:ascii="Calibri Light" w:hAnsi="Calibri Light" w:cs="Calibri Light"/>
+              <w:noProof/>
+              <w:sz w:val="20"/>
+            </w:rPr>
+          </w:pPr>
+        </w:p>
+      </w:tc>
+      <w:tc>
+        <w:tcPr>
+          <w:tcW w:w="2847" w:type="dxa"/>
+          <w:vMerge w:val="restart"/>
+          <w:tcBorders>
+            <w:top w:val="single" w:sz="4" w:space="0" w:color="auto"/>
+            <w:left w:val="single" w:sz="4" w:space="0" w:color="auto"/>
+            <w:bottom w:val="single" w:sz="4" w:space="0" w:color="auto"/>
+            <w:right w:val="single" w:sz="4" w:space="0" w:color="auto"/>
+          </w:tcBorders>
+          <w:vAlign w:val="center"/>
+          <w:hideMark/>
+        </w:tcPr>
+        <w:p>
+          <w:pPr>
+            <w:pStyle w:val="Header"/>
+            <w:spacing w:line="276" w:lineRule="auto"/>
+            <w:jc w:val="left"/>
+            <w:rPr>
+              <w:rFonts w:ascii="Calibri Light" w:hAnsi="Calibri Light" w:cs="Calibri Light"/>
+              <w:sz w:val="20"/>
+            </w:rPr>
+          </w:pPr>
+          <w:r>
+            <w:rPr>
+              <w:rFonts w:ascii="Calibri Light" w:hAnsi="Calibri Light" w:cs="Calibri Light"/>
+              <w:b/>
+              <w:bCs/>
+              <w:sz w:val="20"/>
+            </w:rPr>
+            <w:t>UBICACIÓN:</w:t>
+          </w:r>
+          <w:r>
+            <w:rPr>
+              <w:rFonts w:ascii="Calibri Light" w:hAnsi="Calibri Light" w:cs="Calibri Light"/>
+              <w:sz w:val="20"/>
+            </w:rPr>
+            <w:t xml:space="preserve"> </w:t>
+          </w:r>
+        </w:p>
+        <w:p>
+          <w:pPr>
+            <w:pStyle w:val="Header"/>
+            <w:spacing w:line="276" w:lineRule="auto"/>
+            <w:jc w:val="center"/>
+            <w:rPr>
+              <w:rFonts w:ascii="Calibri Light" w:hAnsi="Calibri Light" w:cs="Calibri Light"/>
+              <w:b/>
+              <w:bCs/>
+              <w:sz w:val="20"/>
+            </w:rPr>
+          </w:pPr>
+          <w:r>
+            <w:rPr>
+              <w:rFonts w:ascii="Calibri Light" w:hAnsi="Calibri Light" w:cs="Calibri Light"/>
+              <w:sz w:val="20"/>
+            </w:rPr>
+            <w:t>&lt;&lt;UBICACION&gt;&gt;</w:t>
+          </w:r>
+        </w:p>
+      </w:tc>
+      <w:tc>
+        <w:tcPr>
+          <w:tcW w:w="2866" w:type="dxa"/>
+          <w:vMerge w:val="restart"/>
+          <w:tcBorders>
+            <w:top w:val="single" w:sz="4" w:space="0" w:color="auto"/>
+            <w:left w:val="single" w:sz="4" w:space="0" w:color="auto"/>
+            <w:bottom w:val="single" w:sz="4" w:space="0" w:color="auto"/>
+            <w:right w:val="single" w:sz="4" w:space="0" w:color="auto"/>
+          </w:tcBorders>
+          <w:vAlign w:val="center"/>
+        </w:tcPr>
+        <w:p>
+          <w:pPr>
+            <w:pStyle w:val="Header"/>
+            <w:spacing w:line="276" w:lineRule="auto"/>
+            <w:jc w:val="left"/>
+            <w:rPr>
+              <w:rFonts w:ascii="Calibri Light" w:hAnsi="Calibri Light" w:cs="Calibri Light"/>
+              <w:sz w:val="20"/>
+            </w:rPr>
+          </w:pPr>
+          <w:r>
+            <w:rPr>
+              <w:rFonts w:ascii="Calibri Light" w:hAnsi="Calibri Light" w:cs="Calibri Light"/>
+              <w:b/>
+              <w:bCs/>
+              <w:sz w:val="20"/>
+            </w:rPr>
+            <w:t>TIPO DE CONTRATO:</w:t>
+          </w:r>
+          <w:r>
+            <w:rPr>
+              <w:rFonts w:ascii="Calibri Light" w:hAnsi="Calibri Light" w:cs="Calibri Light"/>
+              <w:sz w:val="20"/>
+            </w:rPr>
+            <w:t xml:space="preserve"> </w:t>
+          </w:r>
+        </w:p>
+        <w:p>
+          <w:pPr>
+            <w:pStyle w:val="Header"/>
+            <w:jc w:val="center"/>
+            <w:rPr>
+              <w:rFonts w:ascii="Calibri Light" w:hAnsi="Calibri Light" w:cs="Calibri Light"/>
+              <w:sz w:val="20"/>
+            </w:rPr>
+          </w:pPr>
+          <w:r>
+            <w:rPr>
+              <w:rFonts w:ascii="Calibri Light" w:hAnsi="Calibri Light" w:cs="Calibri Light"/>
+              <w:sz w:val="20"/>
+            </w:rPr>
+            <w:t>&lt;&lt;TIPO_CONTRATO&gt;&gt;</w:t>
+          </w:r>
+        </w:p>
+      </w:tc>
+      <w:tc>
+        <w:tcPr>
+          <w:tcW w:w="1810" w:type="dxa"/>
+          <w:vMerge w:val="restart"/>
+          <w:tcBorders>
+            <w:top w:val="single" w:sz="4" w:space="0" w:color="auto"/>
+            <w:left w:val="single" w:sz="4" w:space="0" w:color="auto"/>
+            <w:right w:val="single" w:sz="4" w:space="0" w:color="auto"/>
+          </w:tcBorders>
+        </w:tcPr>
+        <w:p>
+          <w:pPr>
+            <w:pStyle w:val="Header"/>
+            <w:rPr>
+              <w:rFonts w:ascii="Calibri Light" w:hAnsi="Calibri Light" w:cs="Calibri Light"/>
+              <w:b/>
+              <w:bCs/>
+              <w:sz w:val="20"/>
+            </w:rPr>
+          </w:pPr>
+          <w:r>
+            <w:rPr>
+              <w:rFonts w:ascii="Calibri Light" w:hAnsi="Calibri Light" w:cs="Calibri Light"/>
+              <w:b/>
+              <w:bCs/>
+              <w:sz w:val="20"/>
+            </w:rPr>
+            <w:t>FECHA:</w:t>
+          </w:r>
+        </w:p>
+        <w:p>
+          <w:pPr>
+            <w:pStyle w:val="Header"/>
+            <w:jc w:val="center"/>
+            <w:rPr>
+              <w:rFonts w:ascii="Calibri Light" w:hAnsi="Calibri Light" w:cs="Calibri Light"/>
+              <w:b/>
+              <w:bCs/>
+              <w:sz w:val="20"/>
+            </w:rPr>
+          </w:pPr>
+          <w:r>
+            <w:rPr>
+              <w:rFonts w:ascii="Calibri Light" w:hAnsi="Calibri Light" w:cs="Calibri Light"/>
+              <w:b/>
+              <w:bCs/>
+              <w:sz w:val="20"/>
+            </w:rPr>
+            <w:t>&lt;&lt;FECHA&gt;&gt;</w:t>
+          </w:r>
+        </w:p>
+      </w:tc>
+    </w:tr>
+    <w:tr>
+      <w:trPr>
+        <w:trHeight w:val="346"/>
+        <w:jc w:val="center"/>
+      </w:trPr>
+      <w:tc>
+        <w:tcPr>
+          <w:tcW w:w="1261" w:type="dxa"/>
           <w:tcBorders>
             <w:top w:val="single" w:sz="4" w:space="0" w:color="auto"/>
             <w:left w:val="single" w:sz="4" w:space="0" w:color="auto"/>
@@ -834,7 +569,7 @@
               <w:bCs/>
               <w:sz w:val="20"/>
             </w:rPr>
-            <w:t>DOC.VERSION:</w:t>
+            <w:t>REVISIÓN:</w:t>
           </w:r>
         </w:p>
         <w:p>
@@ -896,35 +631,37 @@
       </w:tc>
       <w:tc>
         <w:tcPr>
-          <w:tcW w:w="2268" w:type="dxa"/>
+          <w:tcW w:w="0" w:type="auto"/>
+          <w:vMerge/>
           <w:tcBorders>
             <w:top w:val="single" w:sz="4" w:space="0" w:color="auto"/>
             <w:left w:val="single" w:sz="4" w:space="0" w:color="auto"/>
             <w:bottom w:val="single" w:sz="4" w:space="0" w:color="auto"/>
             <w:right w:val="single" w:sz="4" w:space="0" w:color="auto"/>
           </w:tcBorders>
-          <w:hideMark/>
+          <w:vAlign w:val="center"/>
         </w:tcPr>
         <w:p>
           <w:pPr>
-            <w:pStyle w:val="Header"/>
             <w:rPr>
               <w:rFonts w:ascii="Calibri Light" w:hAnsi="Calibri Light" w:cs="Calibri Light"/>
-              <w:b/>
-              <w:bCs/>
+              <w:kern w:val="2"/>
               <w:sz w:val="20"/>
+              <w14:ligatures w14:val="standardContextual"/>
             </w:rPr>
           </w:pPr>
-          <w:r>
-            <w:rPr>
-              <w:rFonts w:ascii="Calibri Light" w:hAnsi="Calibri Light" w:cs="Calibri Light"/>
-              <w:b/>
-              <w:bCs/>
-              <w:sz w:val="20"/>
-            </w:rPr>
-            <w:t>FECHA:</w:t>
-          </w:r>
         </w:p>
+      </w:tc>
+      <w:tc>
+        <w:tcPr>
+          <w:tcW w:w="1810" w:type="dxa"/>
+          <w:vMerge/>
+          <w:tcBorders>
+            <w:left w:val="single" w:sz="4" w:space="0" w:color="auto"/>
+            <w:bottom w:val="single" w:sz="4" w:space="0" w:color="auto"/>
+            <w:right w:val="single" w:sz="4" w:space="0" w:color="auto"/>
+          </w:tcBorders>
+        </w:tcPr>
         <w:p>
           <w:pPr>
             <w:pStyle w:val="Header"/>
@@ -936,15 +673,6 @@
               <w:sz w:val="20"/>
             </w:rPr>
           </w:pPr>
-          <w:r>
-            <w:rPr>
-              <w:rFonts w:ascii="Calibri Light" w:hAnsi="Calibri Light" w:cs="Calibri Light"/>
-              <w:b/>
-              <w:bCs/>
-              <w:sz w:val="20"/>
-            </w:rPr>
-            <w:t>&lt;&lt;FECHA&gt;&gt;</w:t>
-          </w:r>
         </w:p>
       </w:tc>
     </w:tr>
@@ -1675,7 +1403,7 @@
       <w:b/>
       <w:bCs/>
       <w:iCs/>
-      <w:color w:val="0070C0"/>
+      <w:color w:val="1F2937"/>
       <w:sz w:val="28"/>
       <w:szCs w:val="28"/>
     </w:rPr>
@@ -1704,7 +1432,7 @@
       <w:b/>
       <w:bCs/>
       <w:caps/>
-      <w:color w:val="0070C0"/>
+      <w:color w:val="1F2937"/>
       <w:sz w:val="22"/>
       <w:szCs w:val="22"/>
     </w:rPr>
@@ -1726,6 +1454,7 @@
       <w:outlineLvl w:val="2"/>
     </w:pPr>
     <w:rPr>
+      <w:color w:val="6B7280"/>
       <w:sz w:val="20"/>
       <w:szCs w:val="24"/>
     </w:rPr>

</xml_diff>